<commit_message>
legal: bump EULA to v1.8
Commit 4b21400 changed EULA content (company name to SERVALABS PRIVATE
LIMITED, signature block reformat) without bumping the version, leaving
two different documents both labelled v1.7. The reseller Commercial and
Product Schedule records an "Approved end-customer terms title/version"
value, which was therefore ambiguous.

Version 1.8, effective 2026-08-25. No clause text changed. DOCX
regenerated; PRIVACY.docx was byte-identical and left alone.

Section 20's INR 1,000 liability floor is retained at the user's express
direction. EULA_GAP_AUDIT P0-04 remains open on that point.

Co-Authored-By: Claude Opus 5 <noreply@anthropic.com>
</commit_message>
<xml_diff>
--- a/legal/EULA.docx
+++ b/legal/EULA.docx
@@ -41,7 +41,7 @@
           <w:color w:val="5B6573"/>
           <w:sz w:val="22"/>
         </w:rPr>
-        <w:t>Version 1.7 - 9 August 2026</w:t>
+        <w:t>Version 1.8 - 25 August 2026</w:t>
       </w:r>
     </w:p>
     <w:tbl>
@@ -99,7 +99,7 @@
                 <w:rFonts w:ascii="Calibri" w:hAnsi="Calibri" w:eastAsia="Calibri"/>
                 <w:sz w:val="22"/>
               </w:rPr>
-              <w:t>SL-PUBLIC-EULA-1.7</w:t>
+              <w:t>SL-PUBLIC-EULA-1.8</w:t>
             </w:r>
           </w:p>
         </w:tc>
@@ -147,7 +147,7 @@
                 <w:rFonts w:ascii="Calibri" w:hAnsi="Calibri" w:eastAsia="Calibri"/>
                 <w:sz w:val="22"/>
               </w:rPr>
-              <w:t>9 August 2026</w:t>
+              <w:t>25 August 2026</w:t>
             </w:r>
           </w:p>
         </w:tc>
@@ -4913,7 +4913,7 @@
         <w:color w:val="5B6573"/>
         <w:sz w:val="17"/>
       </w:rPr>
-      <w:t>Master Use Agreement (EULA) | Version 1.7 - 9 August 2026</w:t>
+      <w:t>Master Use Agreement (EULA) | Version 1.8 - 25 August 2026</w:t>
     </w:r>
   </w:p>
 </w:hdr>

</xml_diff>

<commit_message>
legal: raise EULA liability floor to INR 20,000 (v1.9)
Section 20 limb (c) changed from INR 1,000 to INR 20,000. The cap
remains the greatest of (a) 12 months' payments, (b) the price paid for
the item, or (c) the floor, so this only affects claims where the
customer has paid little or nothing.

Version 1.9 rather than amending v1.8: v1.8 was pushed in c85b2af with
the INR 1,000 text and carries today's effective date, so reusing the
number would recreate the exact ambiguity that bump was meant to fix.

EULA_GAP_AUDIT P0-04 (consumer safeguards) is narrowed but not closed;
"regardless of cause" in s17.4 remains the wider exposure on that point.

DOCX regenerated. PRIVACY.docx byte-identical and left alone.

Co-Authored-By: Claude Opus 5 <noreply@anthropic.com>
</commit_message>
<xml_diff>
--- a/legal/EULA.docx
+++ b/legal/EULA.docx
@@ -41,7 +41,7 @@
           <w:color w:val="5B6573"/>
           <w:sz w:val="22"/>
         </w:rPr>
-        <w:t>Version 1.8 - 25 August 2026</w:t>
+        <w:t>Version 1.9 - 25 August 2026</w:t>
       </w:r>
     </w:p>
     <w:tbl>
@@ -99,7 +99,7 @@
                 <w:rFonts w:ascii="Calibri" w:hAnsi="Calibri" w:eastAsia="Calibri"/>
                 <w:sz w:val="22"/>
               </w:rPr>
-              <w:t>SL-PUBLIC-EULA-1.8</w:t>
+              <w:t>SL-PUBLIC-EULA-1.9</w:t>
             </w:r>
           </w:p>
         </w:tc>
@@ -4184,7 +4184,7 @@
           <w:b/>
           <w:sz w:val="22"/>
         </w:rPr>
-        <w:t>To the maximum extent permitted by law, ServaLabs' total aggregate liability arising out of or related to this Agreement — whether in contract, tort, negligence, strict liability, or otherwise — shall not exceed the greatest of: (a) the total amount paid by the Customer to ServaLabs in the twelve (12) months preceding the event giving rise to liability; (b) the price paid for the Product or Software licence giving rise to the claim, whether paid to ServaLabs or, in a Reseller Sale, to the reseller; or (c) INR 1,000.</w:t>
+        <w:t>To the maximum extent permitted by law, ServaLabs' total aggregate liability arising out of or related to this Agreement — whether in contract, tort, negligence, strict liability, or otherwise — shall not exceed the greatest of: (a) the total amount paid by the Customer to ServaLabs in the twelve (12) months preceding the event giving rise to liability; (b) the price paid for the Product or Software licence giving rise to the claim, whether paid to ServaLabs or, in a Reseller Sale, to the reseller; or (c) INR 20,000.</w:t>
       </w:r>
       <w:r>
         <w:rPr>
@@ -4913,7 +4913,7 @@
         <w:color w:val="5B6573"/>
         <w:sz w:val="17"/>
       </w:rPr>
-      <w:t>Master Use Agreement (EULA) | Version 1.8 - 25 August 2026</w:t>
+      <w:t>Master Use Agreement (EULA) | Version 1.9 - 25 August 2026</w:t>
     </w:r>
   </w:p>
 </w:hdr>

</xml_diff>